<commit_message>
Update multiple dynamic code documentation files with recent changes
</commit_message>
<xml_diff>
--- a/docx/dynamic-code-docs/Configure-PhysicalBuild.docx
+++ b/docx/dynamic-code-docs/Configure-PhysicalBuild.docx
@@ -329,7 +329,7 @@
               <w:pStyle w:val="Compact"/>
             </w:pPr>
             <w:r>
-              <w:t xml:space="preserve">PSCredential for the iLO Redfish check. If omitted, prompted interactively.</w:t>
+              <w:t xml:space="preserve">Optional direct iLO PSCredential for unmanaged-server fallback. For OneView-managed servers, the build uses OneView iLO SSO and does not use this credential.</w:t>
             </w:r>
           </w:p>
         </w:tc>
@@ -2333,7 +2333,7 @@
         <w:rPr>
           <w:rStyle w:val="NormalTok"/>
         </w:rPr>
-        <w:t xml:space="preserve">        PSCredential </w:t>
+        <w:t xml:space="preserve">        Optional direct iLO PSCredential </w:t>
       </w:r>
       <w:r>
         <w:rPr>
@@ -2345,31 +2345,34 @@
         <w:rPr>
           <w:rStyle w:val="NormalTok"/>
         </w:rPr>
-        <w:t xml:space="preserve"> the iLO Redfish check</w:t>
-      </w:r>
-      <w:r>
-        <w:rPr>
-          <w:rStyle w:val="OperatorTok"/>
-        </w:rPr>
-        <w:t xml:space="preserve">.</w:t>
-      </w:r>
-      <w:r>
-        <w:rPr>
-          <w:rStyle w:val="NormalTok"/>
-        </w:rPr>
-        <w:t xml:space="preserve"> </w:t>
+        <w:t xml:space="preserve"> unmanaged-server fallback</w:t>
+      </w:r>
+      <w:r>
+        <w:rPr>
+          <w:rStyle w:val="OperatorTok"/>
+        </w:rPr>
+        <w:t xml:space="preserve">.</w:t>
+      </w:r>
+      <w:r>
+        <w:br/>
+      </w:r>
+      <w:r>
+        <w:rPr>
+          <w:rStyle w:val="NormalTok"/>
+        </w:rPr>
+        <w:t xml:space="preserve">        </w:t>
       </w:r>
       <w:r>
         <w:rPr>
           <w:rStyle w:val="ControlFlowTok"/>
         </w:rPr>
-        <w:t xml:space="preserve">If</w:t>
-      </w:r>
-      <w:r>
-        <w:rPr>
-          <w:rStyle w:val="NormalTok"/>
-        </w:rPr>
-        <w:t xml:space="preserve"> omitted</w:t>
+        <w:t xml:space="preserve">For</w:t>
+      </w:r>
+      <w:r>
+        <w:rPr>
+          <w:rStyle w:val="NormalTok"/>
+        </w:rPr>
+        <w:t xml:space="preserve"> OneView-managed servers</w:t>
       </w:r>
       <w:r>
         <w:rPr>
@@ -2381,7 +2384,16 @@
         <w:rPr>
           <w:rStyle w:val="NormalTok"/>
         </w:rPr>
-        <w:t xml:space="preserve"> prompted interactively</w:t>
+        <w:t xml:space="preserve"> the build uses OneView iLO SSO and does not</w:t>
+      </w:r>
+      <w:r>
+        <w:br/>
+      </w:r>
+      <w:r>
+        <w:rPr>
+          <w:rStyle w:val="NormalTok"/>
+        </w:rPr>
+        <w:t xml:space="preserve">        use this credential</w:t>
       </w:r>
       <w:r>
         <w:rPr>

</xml_diff>